<commit_message>
Resumo de atividade — 8 de setembro de 2026
</commit_message>
<xml_diff>
--- a/Resumo_atividade/Resumo_atividade_SurveyOS_20260908.docx
+++ b/Resumo_atividade/Resumo_atividade_SurveyOS_20260908.docx
@@ -49,7 +49,7 @@
           <w:sz w:val="18"/>
           <w:szCs w:val="18"/>
         </w:rPr>
-        <w:t xml:space="preserve">Posição em 8 de setembro de 2026   ·   89 ordens de serviço avaliadas   ·   Redes — PR, MG, SP</w:t>
+        <w:t xml:space="preserve">Posição em 8 de setembro de 2026   ·   88 ordens de serviço avaliadas   ·   Redes — PR, MG, SP, —</w:t>
       </w:r>
     </w:p>
     <w:tbl>
@@ -96,7 +96,7 @@
                 <w:sz w:val="24"/>
                 <w:szCs w:val="24"/>
               </w:rPr>
-              <w:t xml:space="preserve">Das 89 ordens avaliadas, 64 foram encerradas. PR concluiu 41 das 58 abertas na região; MG concluiu 19 das 22 abertas na região; SP concluiu 4 das 9 abertas na região. Todas as regiões têm técnico atribuído em ao menos uma ordem.</w:t>
+              <w:t xml:space="preserve">Das 88 ordens avaliadas, 79 foram encerradas. PR concluiu 55 das 58 abertas na região; MG concluiu 19 das 20 abertas na região; SP concluiu 4 das 9 abertas na região; — concluiu 1 das 1 abertas na região. Todas as regiões têm técnico atribuído em ao menos uma ordem.</w:t>
             </w:r>
           </w:p>
         </w:tc>
@@ -155,7 +155,7 @@
                 <w:sz w:val="44"/>
                 <w:szCs w:val="44"/>
               </w:rPr>
-              <w:t xml:space="preserve">89</w:t>
+              <w:t xml:space="preserve">88</w:t>
             </w:r>
           </w:p>
           <w:p>
@@ -205,7 +205,7 @@
                 <w:sz w:val="44"/>
                 <w:szCs w:val="44"/>
               </w:rPr>
-              <w:t xml:space="preserve">64</w:t>
+              <w:t xml:space="preserve">79</w:t>
             </w:r>
           </w:p>
           <w:p>
@@ -255,7 +255,7 @@
                 <w:sz w:val="44"/>
                 <w:szCs w:val="44"/>
               </w:rPr>
-              <w:t xml:space="preserve">3</w:t>
+              <w:t xml:space="preserve">1</w:t>
             </w:r>
           </w:p>
           <w:p>
@@ -305,7 +305,7 @@
                 <w:sz w:val="44"/>
                 <w:szCs w:val="44"/>
               </w:rPr>
-              <w:t xml:space="preserve">4</w:t>
+              <w:t xml:space="preserve">3</w:t>
             </w:r>
           </w:p>
           <w:p>
@@ -361,7 +361,7 @@
           <w:sz w:val="20"/>
           <w:szCs w:val="20"/>
         </w:rPr>
-        <w:t xml:space="preserve">PR tem técnico atribuído em 58 das 58 ordens, com 41 encerradas. MG tem técnico atribuído em 20 das 22 ordens, com 19 encerradas. SP tem técnico atribuído em 8 das 9 ordens, com 4 encerradas.</w:t>
+        <w:t xml:space="preserve">PR tem técnico atribuído em 58 das 58 ordens, com 55 encerradas. MG tem técnico atribuído em 20 das 20 ordens, com 19 encerradas. SP tem técnico atribuído em 8 das 9 ordens, com 4 encerradas. — tem técnico atribuído em 1 das 1 ordem, com 1 encerrada.</w:t>
       </w:r>
     </w:p>
     <w:tbl>
@@ -378,9 +378,10 @@
       </w:tblPr>
       <w:tblGrid>
         <w:gridCol w:w="2438"/>
-        <w:gridCol w:w="2400"/>
-        <w:gridCol w:w="2400"/>
-        <w:gridCol w:w="2400"/>
+        <w:gridCol w:w="1800"/>
+        <w:gridCol w:w="1800"/>
+        <w:gridCol w:w="1800"/>
+        <w:gridCol w:w="1800"/>
       </w:tblGrid>
       <w:tr>
         <w:tc>
@@ -417,7 +418,7 @@
         </w:tc>
         <w:tc>
           <w:tcPr>
-            <w:tcW w:type="dxa" w:w="2400"/>
+            <w:tcW w:type="dxa" w:w="1800"/>
             <w:tcBorders>
               <w:top w:val="single" w:color="D6DEDF" w:sz="4"/>
               <w:left w:val="single" w:color="D6DEDF" w:sz="4"/>
@@ -452,7 +453,7 @@
         </w:tc>
         <w:tc>
           <w:tcPr>
-            <w:tcW w:type="dxa" w:w="2400"/>
+            <w:tcW w:type="dxa" w:w="1800"/>
             <w:tcBorders>
               <w:top w:val="single" w:color="D6DEDF" w:sz="4"/>
               <w:left w:val="single" w:color="D6DEDF" w:sz="4"/>
@@ -487,7 +488,7 @@
         </w:tc>
         <w:tc>
           <w:tcPr>
-            <w:tcW w:type="dxa" w:w="2400"/>
+            <w:tcW w:type="dxa" w:w="1800"/>
             <w:tcBorders>
               <w:top w:val="single" w:color="D6DEDF" w:sz="4"/>
               <w:left w:val="single" w:color="D6DEDF" w:sz="4"/>
@@ -517,6 +518,41 @@
                 <w:szCs w:val="24"/>
               </w:rPr>
               <w:t xml:space="preserve">SP</w:t>
+            </w:r>
+          </w:p>
+        </w:tc>
+        <w:tc>
+          <w:tcPr>
+            <w:tcW w:type="dxa" w:w="1800"/>
+            <w:tcBorders>
+              <w:top w:val="single" w:color="D6DEDF" w:sz="4"/>
+              <w:left w:val="single" w:color="D6DEDF" w:sz="4"/>
+              <w:bottom w:val="single" w:color="D6DEDF" w:sz="4"/>
+              <w:right w:val="single" w:color="D6DEDF" w:sz="4"/>
+            </w:tcBorders>
+            <w:shd w:fill="1F6F68" w:color="auto" w:val="clear"/>
+            <w:tcMar>
+              <w:top w:type="dxa" w:w="120"/>
+              <w:left w:type="dxa" w:w="140"/>
+              <w:bottom w:type="dxa" w:w="120"/>
+              <w:right w:type="dxa" w:w="140"/>
+            </w:tcMar>
+          </w:tcPr>
+          <w:p>
+            <w:pPr>
+              <w:spacing w:before="0" w:after="0" w:line="276"/>
+              <w:jc w:val="center"/>
+            </w:pPr>
+            <w:r>
+              <w:rPr>
+                <w:rFonts w:ascii="Georgia" w:cs="Georgia" w:eastAsia="Georgia" w:hAnsi="Georgia"/>
+                <w:b/>
+                <w:bCs/>
+                <w:color w:val="FFFFFF"/>
+                <w:sz w:val="24"/>
+                <w:szCs w:val="24"/>
+              </w:rPr>
+              <w:t xml:space="preserve">—</w:t>
             </w:r>
           </w:p>
         </w:tc>
@@ -555,7 +591,7 @@
         </w:tc>
         <w:tc>
           <w:tcPr>
-            <w:tcW w:type="dxa" w:w="2400"/>
+            <w:tcW w:type="dxa" w:w="1800"/>
             <w:tcBorders>
               <w:top w:val="single" w:color="D6DEDF" w:sz="4"/>
               <w:left w:val="single" w:color="D6DEDF" w:sz="4"/>
@@ -589,7 +625,7 @@
         </w:tc>
         <w:tc>
           <w:tcPr>
-            <w:tcW w:type="dxa" w:w="2400"/>
+            <w:tcW w:type="dxa" w:w="1800"/>
             <w:tcBorders>
               <w:top w:val="single" w:color="D6DEDF" w:sz="4"/>
               <w:left w:val="single" w:color="D6DEDF" w:sz="4"/>
@@ -623,7 +659,41 @@
         </w:tc>
         <w:tc>
           <w:tcPr>
-            <w:tcW w:type="dxa" w:w="2400"/>
+            <w:tcW w:type="dxa" w:w="1800"/>
+            <w:tcBorders>
+              <w:top w:val="single" w:color="D6DEDF" w:sz="4"/>
+              <w:left w:val="single" w:color="D6DEDF" w:sz="4"/>
+              <w:bottom w:val="single" w:color="D6DEDF" w:sz="4"/>
+              <w:right w:val="single" w:color="D6DEDF" w:sz="4"/>
+            </w:tcBorders>
+            <w:tcMar>
+              <w:top w:type="dxa" w:w="120"/>
+              <w:left w:type="dxa" w:w="140"/>
+              <w:bottom w:type="dxa" w:w="120"/>
+              <w:right w:type="dxa" w:w="140"/>
+            </w:tcMar>
+          </w:tcPr>
+          <w:p>
+            <w:pPr>
+              <w:spacing w:before="0" w:after="0" w:line="276"/>
+              <w:jc w:val="center"/>
+            </w:pPr>
+            <w:r>
+              <w:rPr>
+                <w:rFonts w:ascii="Calibri" w:cs="Calibri" w:eastAsia="Calibri" w:hAnsi="Calibri"/>
+                <w:b/>
+                <w:bCs/>
+                <w:color w:val="1B7A4B"/>
+                <w:sz w:val="19"/>
+                <w:szCs w:val="19"/>
+              </w:rPr>
+              <w:t xml:space="preserve">Operando</w:t>
+            </w:r>
+          </w:p>
+        </w:tc>
+        <w:tc>
+          <w:tcPr>
+            <w:tcW w:type="dxa" w:w="1800"/>
             <w:tcBorders>
               <w:top w:val="single" w:color="D6DEDF" w:sz="4"/>
               <w:left w:val="single" w:color="D6DEDF" w:sz="4"/>
@@ -690,7 +760,7 @@
         </w:tc>
         <w:tc>
           <w:tcPr>
-            <w:tcW w:type="dxa" w:w="2400"/>
+            <w:tcW w:type="dxa" w:w="1800"/>
             <w:tcBorders>
               <w:top w:val="single" w:color="D6DEDF" w:sz="4"/>
               <w:left w:val="single" w:color="D6DEDF" w:sz="4"/>
@@ -724,7 +794,7 @@
         </w:tc>
         <w:tc>
           <w:tcPr>
-            <w:tcW w:type="dxa" w:w="2400"/>
+            <w:tcW w:type="dxa" w:w="1800"/>
             <w:tcBorders>
               <w:top w:val="single" w:color="D6DEDF" w:sz="4"/>
               <w:left w:val="single" w:color="D6DEDF" w:sz="4"/>
@@ -752,13 +822,13 @@
                 <w:sz w:val="24"/>
                 <w:szCs w:val="24"/>
               </w:rPr>
-              <w:t xml:space="preserve">22</w:t>
-            </w:r>
-          </w:p>
-        </w:tc>
-        <w:tc>
-          <w:tcPr>
-            <w:tcW w:type="dxa" w:w="2400"/>
+              <w:t xml:space="preserve">20</w:t>
+            </w:r>
+          </w:p>
+        </w:tc>
+        <w:tc>
+          <w:tcPr>
+            <w:tcW w:type="dxa" w:w="1800"/>
             <w:tcBorders>
               <w:top w:val="single" w:color="D6DEDF" w:sz="4"/>
               <w:left w:val="single" w:color="D6DEDF" w:sz="4"/>
@@ -787,6 +857,40 @@
                 <w:szCs w:val="24"/>
               </w:rPr>
               <w:t xml:space="preserve">9</w:t>
+            </w:r>
+          </w:p>
+        </w:tc>
+        <w:tc>
+          <w:tcPr>
+            <w:tcW w:type="dxa" w:w="1800"/>
+            <w:tcBorders>
+              <w:top w:val="single" w:color="D6DEDF" w:sz="4"/>
+              <w:left w:val="single" w:color="D6DEDF" w:sz="4"/>
+              <w:bottom w:val="single" w:color="D6DEDF" w:sz="4"/>
+              <w:right w:val="single" w:color="D6DEDF" w:sz="4"/>
+            </w:tcBorders>
+            <w:tcMar>
+              <w:top w:type="dxa" w:w="120"/>
+              <w:left w:type="dxa" w:w="140"/>
+              <w:bottom w:type="dxa" w:w="120"/>
+              <w:right w:type="dxa" w:w="140"/>
+            </w:tcMar>
+          </w:tcPr>
+          <w:p>
+            <w:pPr>
+              <w:spacing w:before="0" w:after="0" w:line="276"/>
+              <w:jc w:val="center"/>
+            </w:pPr>
+            <w:r>
+              <w:rPr>
+                <w:rFonts w:ascii="Georgia" w:cs="Georgia" w:eastAsia="Georgia" w:hAnsi="Georgia"/>
+                <w:b/>
+                <w:bCs/>
+                <w:color w:val="101618"/>
+                <w:sz w:val="24"/>
+                <w:szCs w:val="24"/>
+              </w:rPr>
+              <w:t xml:space="preserve">1</w:t>
             </w:r>
           </w:p>
         </w:tc>
@@ -825,7 +929,7 @@
         </w:tc>
         <w:tc>
           <w:tcPr>
-            <w:tcW w:type="dxa" w:w="2400"/>
+            <w:tcW w:type="dxa" w:w="1800"/>
             <w:tcBorders>
               <w:top w:val="single" w:color="D6DEDF" w:sz="4"/>
               <w:left w:val="single" w:color="D6DEDF" w:sz="4"/>
@@ -859,7 +963,7 @@
         </w:tc>
         <w:tc>
           <w:tcPr>
-            <w:tcW w:type="dxa" w:w="2400"/>
+            <w:tcW w:type="dxa" w:w="1800"/>
             <w:tcBorders>
               <w:top w:val="single" w:color="D6DEDF" w:sz="4"/>
               <w:left w:val="single" w:color="D6DEDF" w:sz="4"/>
@@ -893,7 +997,7 @@
         </w:tc>
         <w:tc>
           <w:tcPr>
-            <w:tcW w:type="dxa" w:w="2400"/>
+            <w:tcW w:type="dxa" w:w="1800"/>
             <w:tcBorders>
               <w:top w:val="single" w:color="D6DEDF" w:sz="4"/>
               <w:left w:val="single" w:color="D6DEDF" w:sz="4"/>
@@ -922,6 +1026,40 @@
                 <w:szCs w:val="24"/>
               </w:rPr>
               <w:t xml:space="preserve">8</w:t>
+            </w:r>
+          </w:p>
+        </w:tc>
+        <w:tc>
+          <w:tcPr>
+            <w:tcW w:type="dxa" w:w="1800"/>
+            <w:tcBorders>
+              <w:top w:val="single" w:color="D6DEDF" w:sz="4"/>
+              <w:left w:val="single" w:color="D6DEDF" w:sz="4"/>
+              <w:bottom w:val="single" w:color="D6DEDF" w:sz="4"/>
+              <w:right w:val="single" w:color="D6DEDF" w:sz="4"/>
+            </w:tcBorders>
+            <w:tcMar>
+              <w:top w:type="dxa" w:w="120"/>
+              <w:left w:type="dxa" w:w="140"/>
+              <w:bottom w:type="dxa" w:w="120"/>
+              <w:right w:type="dxa" w:w="140"/>
+            </w:tcMar>
+          </w:tcPr>
+          <w:p>
+            <w:pPr>
+              <w:spacing w:before="0" w:after="0" w:line="276"/>
+              <w:jc w:val="center"/>
+            </w:pPr>
+            <w:r>
+              <w:rPr>
+                <w:rFonts w:ascii="Georgia" w:cs="Georgia" w:eastAsia="Georgia" w:hAnsi="Georgia"/>
+                <w:b/>
+                <w:bCs/>
+                <w:color w:val="1B7A4B"/>
+                <w:sz w:val="24"/>
+                <w:szCs w:val="24"/>
+              </w:rPr>
+              <w:t xml:space="preserve">1</w:t>
             </w:r>
           </w:p>
         </w:tc>
@@ -960,7 +1098,7 @@
         </w:tc>
         <w:tc>
           <w:tcPr>
-            <w:tcW w:type="dxa" w:w="2400"/>
+            <w:tcW w:type="dxa" w:w="1800"/>
             <w:tcBorders>
               <w:top w:val="single" w:color="D6DEDF" w:sz="4"/>
               <w:left w:val="single" w:color="D6DEDF" w:sz="4"/>
@@ -988,13 +1126,13 @@
                 <w:sz w:val="24"/>
                 <w:szCs w:val="24"/>
               </w:rPr>
-              <w:t xml:space="preserve">41</w:t>
-            </w:r>
-          </w:p>
-        </w:tc>
-        <w:tc>
-          <w:tcPr>
-            <w:tcW w:type="dxa" w:w="2400"/>
+              <w:t xml:space="preserve">55</w:t>
+            </w:r>
+          </w:p>
+        </w:tc>
+        <w:tc>
+          <w:tcPr>
+            <w:tcW w:type="dxa" w:w="1800"/>
             <w:tcBorders>
               <w:top w:val="single" w:color="D6DEDF" w:sz="4"/>
               <w:left w:val="single" w:color="D6DEDF" w:sz="4"/>
@@ -1028,7 +1166,7 @@
         </w:tc>
         <w:tc>
           <w:tcPr>
-            <w:tcW w:type="dxa" w:w="2400"/>
+            <w:tcW w:type="dxa" w:w="1800"/>
             <w:tcBorders>
               <w:top w:val="single" w:color="D6DEDF" w:sz="4"/>
               <w:left w:val="single" w:color="D6DEDF" w:sz="4"/>
@@ -1057,6 +1195,40 @@
                 <w:szCs w:val="24"/>
               </w:rPr>
               <w:t xml:space="preserve">4</w:t>
+            </w:r>
+          </w:p>
+        </w:tc>
+        <w:tc>
+          <w:tcPr>
+            <w:tcW w:type="dxa" w:w="1800"/>
+            <w:tcBorders>
+              <w:top w:val="single" w:color="D6DEDF" w:sz="4"/>
+              <w:left w:val="single" w:color="D6DEDF" w:sz="4"/>
+              <w:bottom w:val="single" w:color="D6DEDF" w:sz="4"/>
+              <w:right w:val="single" w:color="D6DEDF" w:sz="4"/>
+            </w:tcBorders>
+            <w:tcMar>
+              <w:top w:type="dxa" w:w="120"/>
+              <w:left w:type="dxa" w:w="140"/>
+              <w:bottom w:type="dxa" w:w="120"/>
+              <w:right w:type="dxa" w:w="140"/>
+            </w:tcMar>
+          </w:tcPr>
+          <w:p>
+            <w:pPr>
+              <w:spacing w:before="0" w:after="0" w:line="276"/>
+              <w:jc w:val="center"/>
+            </w:pPr>
+            <w:r>
+              <w:rPr>
+                <w:rFonts w:ascii="Georgia" w:cs="Georgia" w:eastAsia="Georgia" w:hAnsi="Georgia"/>
+                <w:b/>
+                <w:bCs/>
+                <w:color w:val="1B7A4B"/>
+                <w:sz w:val="24"/>
+                <w:szCs w:val="24"/>
+              </w:rPr>
+              <w:t xml:space="preserve">1</w:t>
             </w:r>
           </w:p>
         </w:tc>
@@ -1081,7 +1253,7 @@
           <w:sz w:val="26"/>
           <w:szCs w:val="26"/>
         </w:rPr>
-        <w:t xml:space="preserve">Panorama do MG no período</w:t>
+        <w:t xml:space="preserve">Panorama do SP no período</w:t>
       </w:r>
     </w:p>
     <w:p>
@@ -1095,7 +1267,7 @@
           <w:sz w:val="20"/>
           <w:szCs w:val="20"/>
         </w:rPr>
-        <w:t xml:space="preserve">2 ordens estão abertas em 2 cidades, sem técnico atribuído. A região já tem técnicos atuando, então o que resta é fila de delegação pendente, não falta de cadastro.</w:t>
+        <w:t xml:space="preserve">1 ordem está aberta em 1 cidade, sem técnico atribuído. A região já tem técnicos atuando, então o que resta é fila de delegação pendente, não falta de cadastro.</w:t>
       </w:r>
     </w:p>
     <w:tbl>
@@ -1147,7 +1319,7 @@
                 <w:sz w:val="30"/>
                 <w:szCs w:val="30"/>
               </w:rPr>
-              <w:t xml:space="preserve">12,0</w:t>
+              <w:t xml:space="preserve">0,0</w:t>
             </w:r>
           </w:p>
           <w:p>
@@ -1195,7 +1367,7 @@
                 <w:sz w:val="30"/>
                 <w:szCs w:val="30"/>
               </w:rPr>
-              <w:t xml:space="preserve">20</w:t>
+              <w:t xml:space="preserve">0</w:t>
             </w:r>
           </w:p>
           <w:p>
@@ -1209,7 +1381,7 @@
                 <w:sz w:val="16"/>
                 <w:szCs w:val="16"/>
               </w:rPr>
-              <w:t xml:space="preserve">dias da mais antiga (OS-2026-0030, Pouso Alegre)</w:t>
+              <w:t xml:space="preserve">dias da mais antiga (OS-2026-0124, Avaré)</w:t>
             </w:r>
           </w:p>
         </w:tc>
@@ -1291,7 +1463,7 @@
                 <w:sz w:val="30"/>
                 <w:szCs w:val="30"/>
               </w:rPr>
-              <w:t xml:space="preserve">1</w:t>
+              <w:t xml:space="preserve">0</w:t>
             </w:r>
           </w:p>
           <w:p>

</xml_diff>